<commit_message>
TB 1.2.3.1: added a disconnect command
</commit_message>
<xml_diff>
--- a/TigerBridge Documentation.docx
+++ b/TigerBridge Documentation.docx
@@ -98,59 +98,6 @@
         </w:rPr>
         <w:t>, Trevor Holland, Ryan Niiya</w:t>
       </w:r>
-    </w:p>
-    <w:p>
-      <w:pPr>
-        <w:spacing w:line="360" w:lineRule="auto"/>
-        <w:jc w:val="center"/>
-        <w:rPr>
-          <w:rFonts w:cs="Times New Roman"/>
-        </w:rPr>
-      </w:pPr>
-      <w:r>
-        <w:rPr>
-          <w:rFonts w:cs="Times New Roman"/>
-        </w:rPr>
-        <w:t xml:space="preserve">Last edited </w:t>
-      </w:r>
-      <w:r>
-        <w:rPr>
-          <w:rFonts w:cs="Times New Roman"/>
-        </w:rPr>
-        <w:t>2</w:t>
-      </w:r>
-      <w:r>
-        <w:rPr>
-          <w:rFonts w:cs="Times New Roman"/>
-        </w:rPr>
-        <w:t>/</w:t>
-      </w:r>
-      <w:r>
-        <w:rPr>
-          <w:rFonts w:cs="Times New Roman"/>
-        </w:rPr>
-        <w:t>3</w:t>
-      </w:r>
-      <w:r>
-        <w:rPr>
-          <w:rFonts w:cs="Times New Roman"/>
-        </w:rPr>
-        <w:t>/202</w:t>
-      </w:r>
-      <w:r>
-        <w:rPr>
-          <w:rFonts w:cs="Times New Roman"/>
-        </w:rPr>
-        <w:t>5</w:t>
-      </w:r>
-    </w:p>
-    <w:p>
-      <w:pPr>
-        <w:spacing w:line="360" w:lineRule="auto"/>
-        <w:rPr>
-          <w:rFonts w:cs="Times New Roman"/>
-        </w:rPr>
-      </w:pPr>
       <w:r>
         <w:rPr>
           <w:rFonts w:cs="Times New Roman"/>
@@ -1475,6 +1422,7 @@
         <w:rPr>
           <w:rFonts w:asciiTheme="minorHAnsi" w:hAnsiTheme="minorHAnsi" w:cs="Times New Roman"/>
         </w:rPr>
+        <w:lastRenderedPageBreak/>
         <w:t>Establishing Communication</w:t>
       </w:r>
       <w:bookmarkEnd w:id="0"/>
@@ -2083,6 +2031,48 @@
             </w:pPr>
             <w:r>
               <w:t>Requests for the machine to perform a tool cycle.</w:t>
+            </w:r>
+          </w:p>
+        </w:tc>
+        <w:tc>
+          <w:tcPr>
+            <w:tcW w:w="1975" w:type="dxa"/>
+          </w:tcPr>
+          <w:p>
+            <w:pPr>
+              <w:spacing w:line="360" w:lineRule="auto"/>
+            </w:pPr>
+            <w:r>
+              <w:t>None</w:t>
+            </w:r>
+          </w:p>
+        </w:tc>
+      </w:tr>
+      <w:tr>
+        <w:tc>
+          <w:tcPr>
+            <w:tcW w:w="2065" w:type="dxa"/>
+          </w:tcPr>
+          <w:p>
+            <w:pPr>
+              <w:spacing w:line="360" w:lineRule="auto"/>
+            </w:pPr>
+            <w:r>
+              <w:lastRenderedPageBreak/>
+              <w:t>“disconnect”</w:t>
+            </w:r>
+          </w:p>
+        </w:tc>
+        <w:tc>
+          <w:tcPr>
+            <w:tcW w:w="5310" w:type="dxa"/>
+          </w:tcPr>
+          <w:p>
+            <w:pPr>
+              <w:spacing w:line="360" w:lineRule="auto"/>
+            </w:pPr>
+            <w:r>
+              <w:t>Explicitly attempts to close socket connection.</w:t>
             </w:r>
           </w:p>
         </w:tc>
@@ -2800,6 +2790,7 @@
               <w:spacing w:line="360" w:lineRule="auto"/>
             </w:pPr>
             <w:r>
+              <w:lastRenderedPageBreak/>
               <w:t>11</w:t>
             </w:r>
           </w:p>
@@ -3837,6 +3828,7 @@
               <w:spacing w:line="360" w:lineRule="auto"/>
             </w:pPr>
             <w:r>
+              <w:lastRenderedPageBreak/>
               <w:t>117</w:t>
             </w:r>
           </w:p>
@@ -4142,6 +4134,62 @@
             </w:pPr>
             <w:r>
               <w:t>The user attempted to perform a tool cycle while a tool cycle was already in progress.</w:t>
+            </w:r>
+          </w:p>
+        </w:tc>
+      </w:tr>
+      <w:tr>
+        <w:tc>
+          <w:tcPr>
+            <w:tcW w:w="985" w:type="dxa"/>
+          </w:tcPr>
+          <w:p>
+            <w:pPr>
+              <w:spacing w:line="360" w:lineRule="auto"/>
+            </w:pPr>
+            <w:r>
+              <w:t>127</w:t>
+            </w:r>
+          </w:p>
+        </w:tc>
+        <w:tc>
+          <w:tcPr>
+            <w:tcW w:w="8365" w:type="dxa"/>
+          </w:tcPr>
+          <w:p>
+            <w:pPr>
+              <w:spacing w:line="360" w:lineRule="auto"/>
+            </w:pPr>
+            <w:r>
+              <w:t>A disconnect was attempted while the positioner was moving</w:t>
+            </w:r>
+          </w:p>
+        </w:tc>
+      </w:tr>
+      <w:tr>
+        <w:tc>
+          <w:tcPr>
+            <w:tcW w:w="985" w:type="dxa"/>
+          </w:tcPr>
+          <w:p>
+            <w:pPr>
+              <w:spacing w:line="360" w:lineRule="auto"/>
+            </w:pPr>
+            <w:r>
+              <w:t>128</w:t>
+            </w:r>
+          </w:p>
+        </w:tc>
+        <w:tc>
+          <w:tcPr>
+            <w:tcW w:w="8365" w:type="dxa"/>
+          </w:tcPr>
+          <w:p>
+            <w:pPr>
+              <w:spacing w:line="360" w:lineRule="auto"/>
+            </w:pPr>
+            <w:r>
+              <w:t>A disconnect was attempted while the tool was cycling</w:t>
             </w:r>
           </w:p>
         </w:tc>
@@ -4184,6 +4232,7 @@
       </w:pPr>
       <w:bookmarkStart w:id="7" w:name="_Toc188363606"/>
       <w:r>
+        <w:lastRenderedPageBreak/>
         <w:t>Functions</w:t>
       </w:r>
       <w:bookmarkEnd w:id="7"/>
@@ -4452,6 +4501,7 @@
       </w:pPr>
       <w:bookmarkStart w:id="10" w:name="_Toc188363609"/>
       <w:r>
+        <w:lastRenderedPageBreak/>
         <w:t>Get Setting Function</w:t>
       </w:r>
       <w:bookmarkEnd w:id="10"/>
@@ -4836,6 +4886,7 @@
         <w:spacing w:line="360" w:lineRule="auto"/>
       </w:pPr>
       <w:r>
+        <w:lastRenderedPageBreak/>
         <w:t>Request</w:t>
       </w:r>
     </w:p>
@@ -5203,6 +5254,7 @@
         <w:spacing w:line="360" w:lineRule="auto"/>
       </w:pPr>
       <w:r>
+        <w:lastRenderedPageBreak/>
         <w:t xml:space="preserve">For example, </w:t>
       </w:r>
       <w:r>
@@ -5469,6 +5521,7 @@
         <w:spacing w:line="360" w:lineRule="auto"/>
       </w:pPr>
       <w:r>
+        <w:lastRenderedPageBreak/>
         <w:t xml:space="preserve">Cycle Tool </w:t>
       </w:r>
       <w:r>
@@ -5660,6 +5713,107 @@
       </w:r>
     </w:p>
     <w:p>
+      <w:pPr>
+        <w:pStyle w:val="Heading3"/>
+        <w:spacing w:line="360" w:lineRule="auto"/>
+      </w:pPr>
+      <w:r>
+        <w:t>Disconnect</w:t>
+      </w:r>
+      <w:r>
+        <w:t xml:space="preserve"> </w:t>
+      </w:r>
+      <w:r>
+        <w:t>Function</w:t>
+      </w:r>
+    </w:p>
+    <w:p>
+      <w:r>
+        <w:t xml:space="preserve">Attempts to close the client’s socket connection. Disconnecting explicitly will maintain motor state (i.e. if the positioner is holding position, after disconnecting, position will still be holding). </w:t>
+      </w:r>
+    </w:p>
+    <w:p>
+      <w:r>
+        <w:t>Disconnects will be refused while the positioner is moving, or a tool is actively cycling</w:t>
+      </w:r>
+      <w:r>
+        <w:t>.</w:t>
+      </w:r>
+    </w:p>
+    <w:p>
+      <w:r>
+        <w:t>Note that unexpected disconnections, or socket closure without a preceding disconnect command, will result in the motor disengaging.</w:t>
+      </w:r>
+    </w:p>
+    <w:p>
+      <w:pPr>
+        <w:pStyle w:val="Heading4"/>
+        <w:spacing w:line="360" w:lineRule="auto"/>
+      </w:pPr>
+      <w:r>
+        <w:t>Request</w:t>
+      </w:r>
+    </w:p>
+    <w:p>
+      <w:pPr>
+        <w:pStyle w:val="ListParagraph"/>
+        <w:numPr>
+          <w:ilvl w:val="0"/>
+          <w:numId w:val="20"/>
+        </w:numPr>
+      </w:pPr>
+      <w:r>
+        <w:t>Identifier: “disconnect”</w:t>
+      </w:r>
+    </w:p>
+    <w:p>
+      <w:pPr>
+        <w:pStyle w:val="ListParagraph"/>
+        <w:numPr>
+          <w:ilvl w:val="0"/>
+          <w:numId w:val="20"/>
+        </w:numPr>
+      </w:pPr>
+      <w:r>
+        <w:t>Parameters: None</w:t>
+      </w:r>
+    </w:p>
+    <w:p>
+      <w:pPr>
+        <w:pStyle w:val="Heading4"/>
+        <w:spacing w:line="360" w:lineRule="auto"/>
+      </w:pPr>
+      <w:r>
+        <w:t>Response</w:t>
+      </w:r>
+    </w:p>
+    <w:p>
+      <w:pPr>
+        <w:pStyle w:val="ListParagraph"/>
+        <w:numPr>
+          <w:ilvl w:val="0"/>
+          <w:numId w:val="20"/>
+        </w:numPr>
+      </w:pPr>
+      <w:r>
+        <w:t>Possible Error Codes:</w:t>
+      </w:r>
+    </w:p>
+    <w:p>
+      <w:pPr>
+        <w:pStyle w:val="ListParagraph"/>
+        <w:numPr>
+          <w:ilvl w:val="1"/>
+          <w:numId w:val="20"/>
+        </w:numPr>
+      </w:pPr>
+      <w:r>
+        <w:t>127, 128</w:t>
+      </w:r>
+    </w:p>
+    <w:p/>
+    <w:p/>
+    <w:p>
       <w:r>
         <w:br w:type="page"/>
       </w:r>
@@ -5671,6 +5825,7 @@
       </w:pPr>
       <w:bookmarkStart w:id="14" w:name="_Toc188363613"/>
       <w:r>
+        <w:lastRenderedPageBreak/>
         <w:t>Signals</w:t>
       </w:r>
       <w:bookmarkEnd w:id="14"/>

</xml_diff>